<commit_message>
Add clickable calendar days with day events modal
Every day cell in Month/Week/Day views is now clickable. Empty days
navigate to event creation with the date pre-filled. Days with existing
events open a modal listing them with an option to add a new event.

Co-Authored-By: Claude Opus 4.6 <noreply@anthropic.com>
</commit_message>
<xml_diff>
--- a/LoveU app doc.docx
+++ b/LoveU app doc.docx
@@ -25,69 +25,19 @@
         <w:rPr>
           <w:lang w:val="en-US"/>
         </w:rPr>
-        <w:t xml:space="preserve">He is in a mess with following-up the school activities cutoff dates – exams, projects, book reports, events, private teacher lesson. I want both of us to be able to open the app and either update new </w:t>
-      </w:r>
-      <w:proofErr w:type="gramStart"/>
-      <w:r>
-        <w:rPr>
-          <w:lang w:val="en-US"/>
-        </w:rPr>
-        <w:t>event</w:t>
-      </w:r>
-      <w:proofErr w:type="gramEnd"/>
-      <w:r>
-        <w:rPr>
-          <w:lang w:val="en-US"/>
-        </w:rPr>
-        <w:t xml:space="preserve"> or </w:t>
-      </w:r>
-      <w:proofErr w:type="gramStart"/>
-      <w:r>
-        <w:rPr>
-          <w:lang w:val="en-US"/>
-        </w:rPr>
-        <w:t>reading</w:t>
-      </w:r>
-      <w:proofErr w:type="gramEnd"/>
-      <w:r>
-        <w:rPr>
-          <w:lang w:val="en-US"/>
-        </w:rPr>
-        <w:t xml:space="preserve"> the existing events, so it will be centralized in one place. </w:t>
+        <w:t xml:space="preserve">He is in a mess with following-up the school activities cutoff dates – exams, projects, book reports, events, private teacher lesson. I want both of us to be able to open the app and either update new event or </w:t>
       </w:r>
       <w:r>
         <w:rPr>
           <w:lang w:val="en-US"/>
         </w:rPr>
-        <w:t>The name of the app will be called “</w:t>
+        <w:t xml:space="preserve">reading the existing events, so it will be centralized in one place. </w:t>
       </w:r>
-      <w:proofErr w:type="spellStart"/>
       <w:r>
         <w:rPr>
           <w:lang w:val="en-US"/>
         </w:rPr>
-        <w:t>LoveU</w:t>
-      </w:r>
-      <w:proofErr w:type="spellEnd"/>
-      <w:r>
-        <w:rPr>
-          <w:lang w:val="en-US"/>
-        </w:rPr>
-        <w:t xml:space="preserve">”. It will be a dedicated app only for both of us (maybe in the future I would like to give other people the ability to use it for their </w:t>
-      </w:r>
-      <w:proofErr w:type="gramStart"/>
-      <w:r>
-        <w:rPr>
-          <w:lang w:val="en-US"/>
-        </w:rPr>
-        <w:t>kids</w:t>
-      </w:r>
-      <w:proofErr w:type="gramEnd"/>
-      <w:r>
-        <w:rPr>
-          <w:lang w:val="en-US"/>
-        </w:rPr>
-        <w:t xml:space="preserve"> same situation), to update the mentioned events and to follow up on the dates and events. I want to start by having the app UI in English, but </w:t>
+        <w:t xml:space="preserve">The name of the app will be called “LoveU”. It will be a dedicated app only for both of us (maybe in the future I would like to give other people the ability to use it for their kids same situation), to update the mentioned events and to follow up on the dates and events. I want to start by having the app UI in English, but </w:t>
       </w:r>
       <w:r>
         <w:rPr>
@@ -99,21 +49,7 @@
         <w:rPr>
           <w:lang w:val="en-US"/>
         </w:rPr>
-        <w:t xml:space="preserve"> I would like to have it also in </w:t>
-      </w:r>
-      <w:proofErr w:type="gramStart"/>
-      <w:r>
-        <w:rPr>
-          <w:lang w:val="en-US"/>
-        </w:rPr>
-        <w:t>an</w:t>
-      </w:r>
-      <w:proofErr w:type="gramEnd"/>
-      <w:r>
-        <w:rPr>
-          <w:lang w:val="en-US"/>
-        </w:rPr>
-        <w:t xml:space="preserve"> Hebrew format.</w:t>
+        <w:t xml:space="preserve"> I would like to have it also in an Hebrew format.</w:t>
       </w:r>
       <w:r>
         <w:rPr>
@@ -146,7 +82,20 @@
         <w:rPr>
           <w:lang w:val="en-US"/>
         </w:rPr>
-        <w:t>Suggest an architecture for that.</w:t>
+        <w:t>The web app should run as a free web link, Vercel for example, and you will deploy it on my Vercel account</w:t>
+      </w:r>
+    </w:p>
+    <w:p>
+      <w:pPr>
+        <w:rPr>
+          <w:lang w:val="en-US"/>
+        </w:rPr>
+      </w:pPr>
+      <w:r>
+        <w:rPr>
+          <w:lang w:val="en-US"/>
+        </w:rPr>
+        <w:t xml:space="preserve"> </w:t>
       </w:r>
     </w:p>
     <w:sectPr>

</xml_diff>